<commit_message>
Lab 9 handout: say what the two numbers in a program's row are, and which to report
Students were confused by the error and from-you numbers in Part 1's reveal. The paragraph that describes the reveal now names both and says which each question wants, and the two tables' headers say it too.

Co-Authored-By: Claude Fable 5.1 <noreply@anthropic.com>
</commit_message>
<xml_diff>
--- a/spatial_cognition/way_home_lab/way_home_lab_report.docx
+++ b/spatial_cognition/way_home_lab/way_home_lab_report.docx
@@ -155,7 +155,7 @@
               <w:rPr>
                 <w:b/>
               </w:rPr>
-              <w:t xml:space="preserve">Running sum only, m</w:t>
+              <w:t xml:space="preserve">Running sum only, its error, m</w:t>
             </w:r>
           </w:p>
         </w:tc>
@@ -592,7 +592,7 @@
               <w:rPr>
                 <w:b/>
               </w:rPr>
-              <w:t xml:space="preserve">Nearest program to you</w:t>
+              <w:t xml:space="preserve">Nearest program to you (smallest from you)</w:t>
             </w:r>
           </w:p>
         </w:tc>
@@ -605,7 +605,7 @@
               <w:rPr>
                 <w:b/>
               </w:rPr>
-              <w:t xml:space="preserve">Its error, m</w:t>
+              <w:t xml:space="preserve">That program’s error, m</w:t>
             </w:r>
           </w:p>
         </w:tc>

</xml_diff>

<commit_message>
Module 9: chapter corrections (snapshot 0061), lectures 9.2-9.3 rebuilt, Lab 9 handout fixes, legacy lab removed
</commit_message>
<xml_diff>
--- a/spatial_cognition/way_home_lab/way_home_lab_report.docx
+++ b/spatial_cognition/way_home_lab/way_home_lab_report.docx
@@ -1353,7 +1353,7 @@
         <w:pStyle w:val="ListBullet"/>
       </w:pPr>
       <w:r>
-        <w:t xml:space="preserve">Q11. Report your table. In §9.3.2 we said that rats with damage to the hippocampus still swim to a platform they can see but cannot find a hidden one whose position is defined only by the room. Which of your labels learned the hidden platform, and which did not? Removing the cues just before the choice separates two rats that both learned it: one still finds the platform most times, and one fails. Using §9.2.1 and §9.2.7, say which strategy needs the room in view at the moment of the choice and which can work from where it already is, and name the two labels. Then say why the visible platform is found by every rat, and what that tells you about what a beacon is.</w:t>
+        <w:t xml:space="preserve">Q11. Report your table. In §9.3.2 we said that rats with damage to the hippocampus still swim to a platform they can see but cannot find a hidden one whose position is defined only by the room. Which of your labels learned the hidden platform, and which did not? Removing the cues just before the choice separates two rats that both learned it: one still finds the platform most times, and one fails. Using §9.2.1 and §9.2.7, say which strategy needs the room in view at the moment of the choice and which can work from where it already is, and name the two labels. Then say why H finds the visible platform, and what that tells you about what a beacon is.</w:t>
       </w:r>
     </w:p>
     <w:p/>
@@ -1590,7 +1590,7 @@
         <w:pStyle w:val="ListBullet"/>
       </w:pPr>
       <w:r>
-        <w:t xml:space="preserve">Q12. Report your table. With the lamp in place, two hidden rats that differ in every other test take the same path, path 6; with the lamp moved, one of them follows it to path 1 and the other stays on path 6. In §9.1.6 we said why the lamp in Tolman's room was a problem for his interpretation. Say, in the programs' terms, what that problem is: which two strategies the lamp in place cannot tell apart, and which change does tell them apart. Then say what the rat that keeps path 6 when the lamp moves must be using, and why we call a route never taken, in §9.1.6, the test of a map.</w:t>
+        <w:t xml:space="preserve">Q12. Report your table. With the lamp in place, every hidden rat but one takes path 6, among them two that the water maze separated; with the lamp moved, one of those two follows it to path 1 and the other stays on path 6. In §9.1.6 we said why the lamp in Tolman's room was a problem for his interpretation. Say, in the programs' terms, what that problem is: which two strategies the lamp in place cannot tell apart, and which change does tell them apart. Then say what the rat that keeps path 6 when the lamp moves must be using, and why we call a route never taken, in §9.1.6, the test of a map.</w:t>
       </w:r>
     </w:p>
     <w:p/>

</xml_diff>

<commit_message>
Lab 9 handout: a countable rule for learns it and finds it in the water maze
A student asked what learns it means when the per-trial times look random. The handout now says to count the test trials under 20 s: learned it when the last four are all under 20 s, found it when at least five of eight are, and to run a borderline rat again. Measured over twenty seeds: the rats that learn the place have all four late trials under 20 s and the others never do; with the cues removed the map rat has five to eight quick trials and the snapshot rat one to six.

Co-Authored-By: Claude Fable 5.1 <noreply@anthropic.com>
</commit_message>
<xml_diff>
--- a/spatial_cognition/way_home_lab/way_home_lab_report.docx
+++ b/spatial_cognition/way_home_lab/way_home_lab_report.docx
@@ -1391,7 +1391,7 @@
               <w:rPr>
                 <w:b/>
               </w:rPr>
-              <w:t xml:space="preserve">Hidden platform: learns it?</w:t>
+              <w:t xml:space="preserve">Hidden platform: learns it? (last four test trials all under 20 s)</w:t>
             </w:r>
           </w:p>
         </w:tc>
@@ -1404,7 +1404,7 @@
               <w:rPr>
                 <w:b/>
               </w:rPr>
-              <w:t xml:space="preserve">Cues removed just before the choice: finds it?</w:t>
+              <w:t xml:space="preserve">Cues removed just before the choice: finds it? (at least five of eight under 20 s)</w:t>
             </w:r>
           </w:p>
         </w:tc>

</xml_diff>